<commit_message>
Update LM Smart Solutions Co-Founder title & updated CV
</commit_message>
<xml_diff>
--- a/public/Laila_Fikry_CV.docx
+++ b/public/Laila_Fikry_CV.docx
@@ -222,10 +222,10 @@
         <w:rPr>
           <w:b/>
         </w:rPr>
-        <w:t>Software Engineer</w:t>
+        <w:t>Co-Founder &amp; Lead Software Engineer</w:t>
       </w:r>
       <w:r>
-        <w:t xml:space="preserve"> | LM Tech Solutions</w:t>
+        <w:t xml:space="preserve"> | LM Smart Solutions</w:t>
       </w:r>
       <w:r>
         <w:rPr>

</xml_diff>

<commit_message>
Update RMS to LM-MS in Experience section
</commit_message>
<xml_diff>
--- a/public/Laila_Fikry_CV.docx
+++ b/public/Laila_Fikry_CV.docx
@@ -51,7 +51,7 @@
         <w:spacing w:after="40"/>
       </w:pPr>
       <w:r>
-        <w:t>Software Engineer and Full-Stack Developer in Year 3 of a B.Sc. Computer Science degree, with production-level experience most candidates do not reach until years into their careers. Architected and deployed RMS 3.0, an enterprise IoT platform actively monitoring 300+ sites and 500+ industrial IoT devices across Egypt for the Ministry of Interior (MOI) and GASCO, achieving sub-second data latency and reducing incident response times by 30%. Engineered backend services in C# and ASP.NET Core, built full-stack web applications with React.js, and designed RESTful APIs. Trained Convolutional Neural Networks (CNN) for real-world emergency response, and integrated CI/CD pipelines and cloud deployments – all while studying full-time. Actively seeking a software engineering internship at an international company where I can contribute from day one.</w:t>
+        <w:t>Software Engineer and Full-Stack Developer in Year 3 of a B.Sc. Computer Science degree, with production-level experience most candidates do not reach until years into their careers. Architected and deployed LM-MS, an enterprise monitoring system actively monitoring 300+ sites and 500+ industrial IoT devices across Egypt for the Ministry of Interior (MOI) and GASCO, achieving sub-second data latency and reducing incident response times by 30%. Engineered backend services in C# and ASP.NET Core, built full-stack web applications with React.js, and designed RESTful APIs. Trained Convolutional Neural Networks (CNN) for real-world emergency response, and integrated CI/CD pipelines and cloud deployments – all while studying full-time. Actively seeking a software engineering internship at an international company where I can contribute from day one.</w:t>
       </w:r>
     </w:p>
     <w:p>
@@ -243,10 +243,10 @@
         <w:rPr>
           <w:b/>
         </w:rPr>
-        <w:t>Architected RMS 3.0 Enterprise IoT Platform:</w:t>
+        <w:t>Architected LM-MS Enterprise Monitoring System:</w:t>
       </w:r>
       <w:r>
-        <w:t xml:space="preserve"> Led full-stack development of the Remote Monitoring System, scaling the architecture to handle concurrent telemetry for 500+ industrial IoT devices across 300+ sites in Egypt with sub-second latency</w:t>
+        <w:t xml:space="preserve"> Led full-stack development of the LM-MS enterprise monitoring system, scaling the architecture to handle concurrent telemetry for 500+ industrial IoT devices across 300+ sites in Egypt with sub-second latency</w:t>
       </w:r>
     </w:p>
     <w:p>
@@ -276,7 +276,7 @@
         <w:t>Led Production Enterprise Deployments:</w:t>
       </w:r>
       <w:r>
-        <w:t xml:space="preserve"> Executed production rollouts of RMS 3.0 for major national clients including the Ministry of Interior (MOI) and GASCO, optimizing SQL Server queries to reduce database load by 40%</w:t>
+        <w:t xml:space="preserve"> Executed production rollouts of LM-MS for major national clients including the Ministry of Interior (MOI) and GASCO, optimizing SQL Server queries to reduce database load by 40%</w:t>
       </w:r>
     </w:p>
     <w:p>

</xml_diff>